<commit_message>
Update report bibliography: shorter, Russian-only sources
</commit_message>
<xml_diff>
--- a/Отчёт.docx
+++ b/Отчёт.docx
@@ -2578,7 +2578,7 @@
         <w:ind w:firstLine="0" w:left="567"/>
       </w:pPr>
       <w:r>
-        <w:t>Троелсен Э., Джепикс Ф. Язык программирования C# 9 и платформа .NET 5. Профессиональная разработка / пер. с англ. — 10-е изд. — М.: Вильямс, 2021. — 1248 с.</w:t>
+        <w:t>Павловская Т. А. C#. Программирование на языке высокого уровня: учебник для вузов. — СПб.: Питер, 2014. — 432 с.</w:t>
       </w:r>
     </w:p>
     <w:p>
@@ -2587,7 +2587,7 @@
         <w:ind w:firstLine="0" w:left="567"/>
       </w:pPr>
       <w:r>
-        <w:t>Шилдт Г. C# 4.0: полное руководство / пер. с англ. — М.: Вильямс, 2020. — 1056 с.</w:t>
+        <w:t>Биллиг В. А. Основы программирования на C#. — М.: Интернет-Университет Информационных Технологий, 2006. — 488 с.</w:t>
       </w:r>
     </w:p>
     <w:p>
@@ -2596,7 +2596,7 @@
         <w:ind w:firstLine="0" w:left="567"/>
       </w:pPr>
       <w:r>
-        <w:t>Албахари Дж., Албахари Б. C# 8.0. Справочник. Полное описание языка / пер. с англ. — М.: Вильямс, 2020. — 1024 с.</w:t>
+        <w:t>Руководство по языку C#. METANIT.COM. URL: https://metanit.com/sharp/tutorial/ (дата обращения: 21.05.2026).</w:t>
       </w:r>
     </w:p>
     <w:p>
@@ -2605,43 +2605,7 @@
         <w:ind w:firstLine="0" w:left="567"/>
       </w:pPr>
       <w:r>
-        <w:t>Рихтер Дж. CLR via C#. Программирование на платформе Microsoft .NET Framework 4.5 на языке C# / пер. с англ. — 4-е изд. — СПб.: Питер, 2017. — 896 с.</w:t>
-      </w:r>
-    </w:p>
-    <w:p>
-      <w:pPr>
-        <w:pStyle w:val="ListNumber"/>
-        <w:ind w:firstLine="0" w:left="567"/>
-      </w:pPr>
-      <w:r>
-        <w:t>Нейгел К. C# 7 и .NET Core 2.0. Разработка кросс-платформенных приложений для профессионалов / пер. с англ. — СПб.: Питер, 2019. — 1056 с.</w:t>
-      </w:r>
-    </w:p>
-    <w:p>
-      <w:pPr>
-        <w:pStyle w:val="ListNumber"/>
-        <w:ind w:firstLine="0" w:left="567"/>
-      </w:pPr>
-      <w:r>
-        <w:t>Кнут Д. Искусство программирования. Т. 2. Получисленные алгоритмы / пер. с англ. — 3-е изд. — М.: Вильямс, 2007. — 832 с.</w:t>
-      </w:r>
-    </w:p>
-    <w:p>
-      <w:pPr>
-        <w:pStyle w:val="ListNumber"/>
-        <w:ind w:firstLine="0" w:left="567"/>
-      </w:pPr>
-      <w:r>
-        <w:t>Microsoft Docs. Документация по Windows Forms для .NET Framework. URL: https://learn.microsoft.com/dotnet/desktop/winforms/ (дата обращения: 21.05.2026).</w:t>
-      </w:r>
-    </w:p>
-    <w:p>
-      <w:pPr>
-        <w:pStyle w:val="ListNumber"/>
-        <w:ind w:firstLine="0" w:left="567"/>
-      </w:pPr>
-      <w:r>
-        <w:t>Microsoft Docs. Справочник по языку C#. URL: https://learn.microsoft.com/dotnet/csharp/language-reference/ (дата обращения: 21.05.2026).</w:t>
+        <w:t>Windows Forms для .NET Framework. Microsoft Learn. URL: https://learn.microsoft.com/ru-ru/dotnet/desktop/winforms/ (дата обращения: 21.05.2026).</w:t>
       </w:r>
     </w:p>
     <w:sectPr>

</xml_diff>